<commit_message>
docs: bitácora (hardening + badge + fechas a día laboral) en bitácora de desarrollo e IPI
- documentacion.md: entrada 2026-06-24 con las 3 tandas (PR #10, #13 y fechas-laborales)
- IPI: ajuste a día laboral en módulo de obras/tareas y en bitácora, tenant incluye bitácora, fila nueva en casos de prueba
- IPI-CONSTRUCTA.docx regenerado

Co-Authored-By: Claude Opus 4.8 <noreply@anthropic.com>
</commit_message>
<xml_diff>
--- a/docs/IPI-CONSTRUCTA.docx
+++ b/docs/IPI-CONSTRUCTA.docx
@@ -4694,7 +4694,7 @@
           <w:color w:val="1A2329"/>
           <w:sz w:val="22"/>
         </w:rPr>
-        <w:t>) que filtra las consultas de obras, responsables, alertas y usuarios.</w:t>
+        <w:t>) que filtra las consultas de obras, responsables, alertas, usuarios y bitácora.</w:t>
       </w:r>
     </w:p>
     <w:p>
@@ -6134,7 +6134,27 @@
           <w:color w:val="1A2329"/>
           <w:sz w:val="22"/>
         </w:rPr>
-        <w:t>: al modificar las fechas de una tarea con sucesoras, el sistema recorre el grafo de dependencias y ofrece una vista previa de las tareas afectadas antes de confirmar, registrando un único evento en el historial.</w:t>
+        <w:t xml:space="preserve">: al modificar las fechas de una tarea con sucesoras, el sistema recorre el grafo de dependencias y ofrece una vista previa de las tareas afectadas antes de confirmar, registrando un único evento en el historial. Además, cuando una fecha de inicio o de fin cae en un día no laboral (fin de semana o feriado del calendario de la obra), el sistema la </w:t>
+      </w:r>
+      <w:r>
+        <w:rPr>
+          <w:rFonts w:ascii="Calibri" w:hAnsi="Calibri"/>
+          <w:b/>
+          <w:i w:val="0"/>
+          <w:color w:val="1A2329"/>
+          <w:sz w:val="22"/>
+        </w:rPr>
+        <w:t>ajusta automáticamente al día laboral más cercano</w:t>
+      </w:r>
+      <w:r>
+        <w:rPr>
+          <w:rFonts w:ascii="Calibri" w:hAnsi="Calibri"/>
+          <w:b w:val="0"/>
+          <w:i w:val="0"/>
+          <w:color w:val="1A2329"/>
+          <w:sz w:val="22"/>
+        </w:rPr>
+        <w:t xml:space="preserve"> en lugar de rechazar la operación, e informa el ajuste realizado.</w:t>
       </w:r>
     </w:p>
     <w:p>
@@ -6449,7 +6469,27 @@
           <w:color w:val="1A2329"/>
           <w:sz w:val="22"/>
         </w:rPr>
-        <w:t xml:space="preserve"> sobre el plan —reprogramar una tarea, crear una tarea, cambiar un estado o dejar una nota—, cada una con una cita del audio que la justifica. Si el audio no contiene nada accionable, no se fuerzan sugerencias.</w:t>
+        <w:t xml:space="preserve"> sobre el plan —reprogramar una tarea, crear una tarea, cambiar un estado o dejar una nota—, cada una con una cita del audio que la justifica. Si el audio no contiene nada accionable, no se fuerzan sugerencias. El modelo recibe el </w:t>
+      </w:r>
+      <w:r>
+        <w:rPr>
+          <w:rFonts w:ascii="Calibri" w:hAnsi="Calibri"/>
+          <w:b/>
+          <w:i w:val="0"/>
+          <w:color w:val="1A2329"/>
+          <w:sz w:val="22"/>
+        </w:rPr>
+        <w:t>calendario laboral</w:t>
+      </w:r>
+      <w:r>
+        <w:rPr>
+          <w:rFonts w:ascii="Calibri" w:hAnsi="Calibri"/>
+          <w:b w:val="0"/>
+          <w:i w:val="0"/>
+          <w:color w:val="1A2329"/>
+          <w:sz w:val="22"/>
+        </w:rPr>
+        <w:t xml:space="preserve"> de la obra para proponer fechas en días hábiles, y las sugerencias se revisan y aplican (Sí/No) desde la aplicación, donde un indicador por obra señala las que quedan pendientes.</w:t>
       </w:r>
     </w:p>
     <w:p>
@@ -7049,6 +7089,63 @@
                 <w:color w:val="1A2329"/>
                 <w:sz w:val="20"/>
               </w:rPr>
+              <w:t>Ajuste a día laboral</w:t>
+            </w:r>
+          </w:p>
+        </w:tc>
+        <w:tc>
+          <w:tcPr>
+            <w:tcW w:type="dxa" w:w="3120"/>
+          </w:tcPr>
+          <w:p>
+            <w:r/>
+            <w:r>
+              <w:rPr>
+                <w:rFonts w:ascii="Calibri" w:hAnsi="Calibri"/>
+                <w:b w:val="0"/>
+                <w:i w:val="0"/>
+                <w:color w:val="1A2329"/>
+                <w:sz w:val="20"/>
+              </w:rPr>
+              <w:t>Crear o mover una tarea con fecha en fin de semana o feriado</w:t>
+            </w:r>
+          </w:p>
+        </w:tc>
+        <w:tc>
+          <w:tcPr>
+            <w:tcW w:type="dxa" w:w="3120"/>
+          </w:tcPr>
+          <w:p>
+            <w:r/>
+            <w:r>
+              <w:rPr>
+                <w:rFonts w:ascii="Calibri" w:hAnsi="Calibri"/>
+                <w:b w:val="0"/>
+                <w:i w:val="0"/>
+                <w:color w:val="1A2329"/>
+                <w:sz w:val="20"/>
+              </w:rPr>
+              <w:t>La fecha se corre al día laboral más cercano con un aviso, sin bloquear la operación.</w:t>
+            </w:r>
+          </w:p>
+        </w:tc>
+      </w:tr>
+      <w:tr>
+        <w:tc>
+          <w:tcPr>
+            <w:tcW w:type="dxa" w:w="3120"/>
+            <w:shd w:val="clear" w:fill="F6F7F6"/>
+          </w:tcPr>
+          <w:p>
+            <w:r/>
+            <w:r>
+              <w:rPr>
+                <w:rFonts w:ascii="Calibri" w:hAnsi="Calibri"/>
+                <w:b w:val="0"/>
+                <w:i w:val="0"/>
+                <w:color w:val="1A2329"/>
+                <w:sz w:val="20"/>
+              </w:rPr>
               <w:t>Bitácora por voz</w:t>
             </w:r>
           </w:p>
@@ -7056,6 +7153,7 @@
         <w:tc>
           <w:tcPr>
             <w:tcW w:type="dxa" w:w="3120"/>
+            <w:shd w:val="clear" w:fill="F6F7F6"/>
           </w:tcPr>
           <w:p>
             <w:r/>
@@ -7074,6 +7172,7 @@
         <w:tc>
           <w:tcPr>
             <w:tcW w:type="dxa" w:w="3120"/>
+            <w:shd w:val="clear" w:fill="F6F7F6"/>
           </w:tcPr>
           <w:p>
             <w:r/>
@@ -7094,7 +7193,6 @@
         <w:tc>
           <w:tcPr>
             <w:tcW w:type="dxa" w:w="3120"/>
-            <w:shd w:val="clear" w:fill="F6F7F6"/>
           </w:tcPr>
           <w:p>
             <w:r/>
@@ -7113,7 +7211,6 @@
         <w:tc>
           <w:tcPr>
             <w:tcW w:type="dxa" w:w="3120"/>
-            <w:shd w:val="clear" w:fill="F6F7F6"/>
           </w:tcPr>
           <w:p>
             <w:r/>
@@ -7132,7 +7229,6 @@
         <w:tc>
           <w:tcPr>
             <w:tcW w:type="dxa" w:w="3120"/>
-            <w:shd w:val="clear" w:fill="F6F7F6"/>
           </w:tcPr>
           <w:p>
             <w:r/>
@@ -7153,6 +7249,7 @@
         <w:tc>
           <w:tcPr>
             <w:tcW w:type="dxa" w:w="3120"/>
+            <w:shd w:val="clear" w:fill="F6F7F6"/>
           </w:tcPr>
           <w:p>
             <w:r/>
@@ -7171,6 +7268,7 @@
         <w:tc>
           <w:tcPr>
             <w:tcW w:type="dxa" w:w="3120"/>
+            <w:shd w:val="clear" w:fill="F6F7F6"/>
           </w:tcPr>
           <w:p>
             <w:r/>
@@ -7189,6 +7287,7 @@
         <w:tc>
           <w:tcPr>
             <w:tcW w:type="dxa" w:w="3120"/>
+            <w:shd w:val="clear" w:fill="F6F7F6"/>
           </w:tcPr>
           <w:p>
             <w:r/>
@@ -7209,7 +7308,6 @@
         <w:tc>
           <w:tcPr>
             <w:tcW w:type="dxa" w:w="3120"/>
-            <w:shd w:val="clear" w:fill="F6F7F6"/>
           </w:tcPr>
           <w:p>
             <w:r/>
@@ -7228,7 +7326,6 @@
         <w:tc>
           <w:tcPr>
             <w:tcW w:type="dxa" w:w="3120"/>
-            <w:shd w:val="clear" w:fill="F6F7F6"/>
           </w:tcPr>
           <w:p>
             <w:r/>
@@ -7247,7 +7344,6 @@
         <w:tc>
           <w:tcPr>
             <w:tcW w:type="dxa" w:w="3120"/>
-            <w:shd w:val="clear" w:fill="F6F7F6"/>
           </w:tcPr>
           <w:p>
             <w:r/>

</xml_diff>

<commit_message>
docs: bitácora por obra + asignación garantizada de la nota de voz (PR #15)
- documentacion.md: entrada 2026-06-25 (página fija a la obra, recordatorio cada 30 min, sección 'Sin asignar')
- IPI: módulo de bitácora con recordatorio + asignación manual, fila nueva en casos de prueba, conteo de migraciones a 0037
- IPI-CONSTRUCTA.docx regenerado

Co-Authored-By: Claude Opus 4.8 <noreply@anthropic.com>
</commit_message>
<xml_diff>
--- a/docs/IPI-CONSTRUCTA.docx
+++ b/docs/IPI-CONSTRUCTA.docx
@@ -2065,7 +2065,7 @@
                 <w:color w:val="1A2329"/>
                 <w:sz w:val="20"/>
               </w:rPr>
-              <w:t>Módulos de obras, tareas, dependencias M2M, subtareas y calendario laboral implementados; migraciones de base de datos hasta la 0030.</w:t>
+              <w:t>Módulos de obras, tareas, dependencias M2M, subtareas y calendario laboral implementados; migraciones de base de datos hasta la 0037.</w:t>
             </w:r>
           </w:p>
         </w:tc>
@@ -4631,7 +4631,7 @@
           <w:color w:val="1A2329"/>
           <w:sz w:val="22"/>
         </w:rPr>
-        <w:t xml:space="preserve"> base de datos relacional PostgreSQL, con esquema versionado mediante migraciones (Alembic, hasta la versión 0030).</w:t>
+        <w:t xml:space="preserve"> base de datos relacional PostgreSQL, con esquema versionado mediante migraciones (Alembic, hasta la versión 0037).</w:t>
       </w:r>
     </w:p>
     <w:p>
@@ -4949,7 +4949,7 @@
           <w:color w:val="1A2329"/>
           <w:sz w:val="22"/>
         </w:rPr>
-        <w:t xml:space="preserve">El modelo de datos, versionado en treinta migraciones (0001 a 0030), se organiza en torno a la entidad </w:t>
+        <w:t xml:space="preserve">El modelo de datos, versionado en treinta y siete migraciones (0001 a 0037), se organiza en torno a la entidad </w:t>
       </w:r>
       <w:r>
         <w:rPr>
@@ -5878,7 +5878,7 @@
           <w:color w:val="1A2329"/>
           <w:sz w:val="22"/>
         </w:rPr>
-        <w:t xml:space="preserve"> versionada (treinta en total, 0001 a 0030), de modo que el esquema de la base pudiera evolucionar de manera reproducible. La cronología completa del desarrollo, con sus decisiones y validaciones, se documenta en </w:t>
+        <w:t xml:space="preserve"> versionada (treinta y siete en total, 0001 a 0037), de modo que el esquema de la base pudiera evolucionar de manera reproducible. La cronología completa del desarrollo, con sus decisiones y validaciones, se documenta en </w:t>
       </w:r>
       <w:r>
         <w:rPr>
@@ -6489,7 +6489,47 @@
           <w:color w:val="1A2329"/>
           <w:sz w:val="22"/>
         </w:rPr>
-        <w:t xml:space="preserve"> de la obra para proponer fechas en días hábiles, y las sugerencias se revisan y aplican (Sí/No) desde la aplicación, donde un indicador por obra señala las que quedan pendientes.</w:t>
+        <w:t xml:space="preserve"> de la obra para proponer fechas en días hábiles, y las sugerencias se revisan y aplican (Sí/No) desde la aplicación —un módulo propio de cada obra— donde un indicador por obra señala las que quedan pendientes. Para no perder ninguna nota, si una nota de voz llega sin obra (un emisor con varias obras que no indicó cuál), el sistema le </w:t>
+      </w:r>
+      <w:r>
+        <w:rPr>
+          <w:rFonts w:ascii="Calibri" w:hAnsi="Calibri"/>
+          <w:b/>
+          <w:i w:val="0"/>
+          <w:color w:val="1A2329"/>
+          <w:sz w:val="22"/>
+        </w:rPr>
+        <w:t>recuerda automáticamente al emisor cada 30 minutos</w:t>
+      </w:r>
+      <w:r>
+        <w:rPr>
+          <w:rFonts w:ascii="Calibri" w:hAnsi="Calibri"/>
+          <w:b w:val="0"/>
+          <w:i w:val="0"/>
+          <w:color w:val="1A2329"/>
+          <w:sz w:val="22"/>
+        </w:rPr>
+        <w:t xml:space="preserve"> —en horario laboral, hasta 48 horas— que la asigne; y si aun así no responde, la nota queda visible en una sección </w:t>
+      </w:r>
+      <w:r>
+        <w:rPr>
+          <w:rFonts w:ascii="Calibri" w:hAnsi="Calibri"/>
+          <w:b/>
+          <w:i w:val="0"/>
+          <w:color w:val="1A2329"/>
+          <w:sz w:val="22"/>
+        </w:rPr>
+        <w:t>"Sin asignar"</w:t>
+      </w:r>
+      <w:r>
+        <w:rPr>
+          <w:rFonts w:ascii="Calibri" w:hAnsi="Calibri"/>
+          <w:b w:val="0"/>
+          <w:i w:val="0"/>
+          <w:color w:val="1A2329"/>
+          <w:sz w:val="22"/>
+        </w:rPr>
+        <w:t xml:space="preserve"> para que el jefe de obra la asigne manualmente, garantizando la trazabilidad.</w:t>
       </w:r>
     </w:p>
     <w:p>
@@ -7204,6 +7244,63 @@
                 <w:color w:val="1A2329"/>
                 <w:sz w:val="20"/>
               </w:rPr>
+              <w:t>Nota de voz sin obra</w:t>
+            </w:r>
+          </w:p>
+        </w:tc>
+        <w:tc>
+          <w:tcPr>
+            <w:tcW w:type="dxa" w:w="3120"/>
+          </w:tcPr>
+          <w:p>
+            <w:r/>
+            <w:r>
+              <w:rPr>
+                <w:rFonts w:ascii="Calibri" w:hAnsi="Calibri"/>
+                <w:b w:val="0"/>
+                <w:i w:val="0"/>
+                <w:color w:val="1A2329"/>
+                <w:sz w:val="20"/>
+              </w:rPr>
+              <w:t>Enviar una nota desde un emisor con varias obras y no responder cuál</w:t>
+            </w:r>
+          </w:p>
+        </w:tc>
+        <w:tc>
+          <w:tcPr>
+            <w:tcW w:type="dxa" w:w="3120"/>
+          </w:tcPr>
+          <w:p>
+            <w:r/>
+            <w:r>
+              <w:rPr>
+                <w:rFonts w:ascii="Calibri" w:hAnsi="Calibri"/>
+                <w:b w:val="0"/>
+                <w:i w:val="0"/>
+                <w:color w:val="1A2329"/>
+                <w:sz w:val="20"/>
+              </w:rPr>
+              <w:t>El sistema recuerda cada 30 min asignar obra (hasta 48 h) y, si no se responde, la nota queda visible para asignación manual del jefe.</w:t>
+            </w:r>
+          </w:p>
+        </w:tc>
+      </w:tr>
+      <w:tr>
+        <w:tc>
+          <w:tcPr>
+            <w:tcW w:type="dxa" w:w="3120"/>
+            <w:shd w:val="clear" w:fill="F6F7F6"/>
+          </w:tcPr>
+          <w:p>
+            <w:r/>
+            <w:r>
+              <w:rPr>
+                <w:rFonts w:ascii="Calibri" w:hAnsi="Calibri"/>
+                <w:b w:val="0"/>
+                <w:i w:val="0"/>
+                <w:color w:val="1A2329"/>
+                <w:sz w:val="20"/>
+              </w:rPr>
               <w:t>Comparación de presupuestos</w:t>
             </w:r>
           </w:p>
@@ -7211,6 +7308,7 @@
         <w:tc>
           <w:tcPr>
             <w:tcW w:type="dxa" w:w="3120"/>
+            <w:shd w:val="clear" w:fill="F6F7F6"/>
           </w:tcPr>
           <w:p>
             <w:r/>
@@ -7229,6 +7327,7 @@
         <w:tc>
           <w:tcPr>
             <w:tcW w:type="dxa" w:w="3120"/>
+            <w:shd w:val="clear" w:fill="F6F7F6"/>
           </w:tcPr>
           <w:p>
             <w:r/>
@@ -7249,7 +7348,6 @@
         <w:tc>
           <w:tcPr>
             <w:tcW w:type="dxa" w:w="3120"/>
-            <w:shd w:val="clear" w:fill="F6F7F6"/>
           </w:tcPr>
           <w:p>
             <w:r/>
@@ -7268,7 +7366,6 @@
         <w:tc>
           <w:tcPr>
             <w:tcW w:type="dxa" w:w="3120"/>
-            <w:shd w:val="clear" w:fill="F6F7F6"/>
           </w:tcPr>
           <w:p>
             <w:r/>
@@ -7287,7 +7384,6 @@
         <w:tc>
           <w:tcPr>
             <w:tcW w:type="dxa" w:w="3120"/>
-            <w:shd w:val="clear" w:fill="F6F7F6"/>
           </w:tcPr>
           <w:p>
             <w:r/>
@@ -7308,6 +7404,7 @@
         <w:tc>
           <w:tcPr>
             <w:tcW w:type="dxa" w:w="3120"/>
+            <w:shd w:val="clear" w:fill="F6F7F6"/>
           </w:tcPr>
           <w:p>
             <w:r/>
@@ -7326,6 +7423,7 @@
         <w:tc>
           <w:tcPr>
             <w:tcW w:type="dxa" w:w="3120"/>
+            <w:shd w:val="clear" w:fill="F6F7F6"/>
           </w:tcPr>
           <w:p>
             <w:r/>
@@ -7344,6 +7442,7 @@
         <w:tc>
           <w:tcPr>
             <w:tcW w:type="dxa" w:w="3120"/>
+            <w:shd w:val="clear" w:fill="F6F7F6"/>
           </w:tcPr>
           <w:p>
             <w:r/>

</xml_diff>

<commit_message>
docs: feedback al emisor, edición de sugerencias y aviso en vivo (PR #17)
- documentacion.md: entrada 2026-06-25 (confirmación al emisor, editar antes de aplicar, toast en tiempo real)
- IPI: módulo de bitácora con edición de sugerencias, confirmación por WhatsApp y notificación en tiempo real
- IPI-CONSTRUCTA.docx regenerado

Co-Authored-By: Claude Opus 4.8 <noreply@anthropic.com>
</commit_message>
<xml_diff>
--- a/docs/IPI-CONSTRUCTA.docx
+++ b/docs/IPI-CONSTRUCTA.docx
@@ -6529,7 +6529,67 @@
           <w:color w:val="1A2329"/>
           <w:sz w:val="22"/>
         </w:rPr>
-        <w:t xml:space="preserve"> para que el jefe de obra la asigne manualmente, garantizando la trazabilidad.</w:t>
+        <w:t xml:space="preserve"> para que el jefe de obra la asigne manualmente, garantizando la trazabilidad. Antes de aplicar una sugerencia, el jefe puede </w:t>
+      </w:r>
+      <w:r>
+        <w:rPr>
+          <w:rFonts w:ascii="Calibri" w:hAnsi="Calibri"/>
+          <w:b/>
+          <w:i w:val="0"/>
+          <w:color w:val="1A2329"/>
+          <w:sz w:val="22"/>
+        </w:rPr>
+        <w:t>editarla</w:t>
+      </w:r>
+      <w:r>
+        <w:rPr>
+          <w:rFonts w:ascii="Calibri" w:hAnsi="Calibri"/>
+          <w:b w:val="0"/>
+          <w:i w:val="0"/>
+          <w:color w:val="1A2329"/>
+          <w:sz w:val="22"/>
+        </w:rPr>
+        <w:t xml:space="preserve"> (ajustar fechas, título, responsable o estado): la IA propone y él decide. Cuando una sugerencia se aplica, el sistema </w:t>
+      </w:r>
+      <w:r>
+        <w:rPr>
+          <w:rFonts w:ascii="Calibri" w:hAnsi="Calibri"/>
+          <w:b/>
+          <w:i w:val="0"/>
+          <w:color w:val="1A2329"/>
+          <w:sz w:val="22"/>
+        </w:rPr>
+        <w:t>le confirma por WhatsApp a quien envió la nota</w:t>
+      </w:r>
+      <w:r>
+        <w:rPr>
+          <w:rFonts w:ascii="Calibri" w:hAnsi="Calibri"/>
+          <w:b w:val="0"/>
+          <w:i w:val="0"/>
+          <w:color w:val="1A2329"/>
+          <w:sz w:val="22"/>
+        </w:rPr>
+        <w:t xml:space="preserve"> qué se hizo, cerrando el círculo del reporte; y la llegada de una nota nueva se anuncia al instante con una </w:t>
+      </w:r>
+      <w:r>
+        <w:rPr>
+          <w:rFonts w:ascii="Calibri" w:hAnsi="Calibri"/>
+          <w:b/>
+          <w:i w:val="0"/>
+          <w:color w:val="1A2329"/>
+          <w:sz w:val="22"/>
+        </w:rPr>
+        <w:t>notificación en tiempo real</w:t>
+      </w:r>
+      <w:r>
+        <w:rPr>
+          <w:rFonts w:ascii="Calibri" w:hAnsi="Calibri"/>
+          <w:b w:val="0"/>
+          <w:i w:val="0"/>
+          <w:color w:val="1A2329"/>
+          <w:sz w:val="22"/>
+        </w:rPr>
+        <w:t xml:space="preserve"> (Socket.IO) al equipo de la obra.</w:t>
       </w:r>
     </w:p>
     <w:p>

</xml_diff>

<commit_message>
docs: vínculo tarea↔nota de voz y búsqueda/filtros (PR #19)
- documentacion.md: entrada 2026-06-25 (origen en la tarea con audio, filtros)
- IPI: trazabilidad navegable tarea↔nota y búsqueda/filtros en el módulo de bitácora
- IPI-CONSTRUCTA.docx regenerado

Co-Authored-By: Claude Opus 4.8 <noreply@anthropic.com>
</commit_message>
<xml_diff>
--- a/docs/IPI-CONSTRUCTA.docx
+++ b/docs/IPI-CONSTRUCTA.docx
@@ -6589,7 +6589,47 @@
           <w:color w:val="1A2329"/>
           <w:sz w:val="22"/>
         </w:rPr>
-        <w:t xml:space="preserve"> (Socket.IO) al equipo de la obra.</w:t>
+        <w:t xml:space="preserve"> (Socket.IO) al equipo de la obra. La trazabilidad es navegable en ambos sentidos: desde una tarea se accede a las </w:t>
+      </w:r>
+      <w:r>
+        <w:rPr>
+          <w:rFonts w:ascii="Calibri" w:hAnsi="Calibri"/>
+          <w:b/>
+          <w:i w:val="0"/>
+          <w:color w:val="1A2329"/>
+          <w:sz w:val="22"/>
+        </w:rPr>
+        <w:t>notas de voz que la originaron o modificaron</w:t>
+      </w:r>
+      <w:r>
+        <w:rPr>
+          <w:rFonts w:ascii="Calibri" w:hAnsi="Calibri"/>
+          <w:b w:val="0"/>
+          <w:i w:val="0"/>
+          <w:color w:val="1A2329"/>
+          <w:sz w:val="22"/>
+        </w:rPr>
+        <w:t xml:space="preserve">, con el audio reproducible y la cita que lo justifica. El historial de notas se explora con </w:t>
+      </w:r>
+      <w:r>
+        <w:rPr>
+          <w:rFonts w:ascii="Calibri" w:hAnsi="Calibri"/>
+          <w:b/>
+          <w:i w:val="0"/>
+          <w:color w:val="1A2329"/>
+          <w:sz w:val="22"/>
+        </w:rPr>
+        <w:t>búsqueda y filtros</w:t>
+      </w:r>
+      <w:r>
+        <w:rPr>
+          <w:rFonts w:ascii="Calibri" w:hAnsi="Calibri"/>
+          <w:b w:val="0"/>
+          <w:i w:val="0"/>
+          <w:color w:val="1A2329"/>
+          <w:sz w:val="22"/>
+        </w:rPr>
+        <w:t xml:space="preserve"> (por texto o responsable, por tipo de acción y por fecha).</w:t>
       </w:r>
     </w:p>
     <w:p>

</xml_diff>

<commit_message>
docs: documentar Gantt (PR #25) y bitácora colapsable (PR #24) + IPI
- Bitácora de desarrollo: dos entradas (2026-06-30) con el detalle de
  ambos merges.
- IPI: enriquecido el módulo de cronograma (Gantt) con zoom continuo
  (pinch/Ctrl+rueda), agrupamiento de subtareas bajo la padre,
  dependencias visibles en la lista y borrado desde la fila.
- Regenerado IPI-CONSTRUCTA.docx.

Co-Authored-By: Claude Opus 4.8 <noreply@anthropic.com>
</commit_message>
<xml_diff>
--- a/docs/IPI-CONSTRUCTA.docx
+++ b/docs/IPI-CONSTRUCTA.docx
@@ -6181,7 +6181,7 @@
           <w:color w:val="1A2329"/>
           <w:sz w:val="22"/>
         </w:rPr>
-        <w:t xml:space="preserve"> visualización interactiva del cronograma con arrastre y redimensionado de barras, vistas de semana, mes y trimestre, flechas de dependencia, </w:t>
+        <w:t xml:space="preserve"> visualización interactiva del cronograma con arrastre y redimensionado de barras, vistas de semana, mes y trimestre y </w:t>
       </w:r>
       <w:r>
         <w:rPr>
@@ -6191,6 +6191,86 @@
           <w:color w:val="1A2329"/>
           <w:sz w:val="22"/>
         </w:rPr>
+        <w:t>zoom continuo</w:t>
+      </w:r>
+      <w:r>
+        <w:rPr>
+          <w:rFonts w:ascii="Calibri" w:hAnsi="Calibri"/>
+          <w:b w:val="0"/>
+          <w:i w:val="0"/>
+          <w:color w:val="1A2329"/>
+          <w:sz w:val="22"/>
+        </w:rPr>
+        <w:t xml:space="preserve"> (gesto de pellizco del </w:t>
+      </w:r>
+      <w:r>
+        <w:rPr>
+          <w:rFonts w:ascii="Calibri" w:hAnsi="Calibri"/>
+          <w:b w:val="0"/>
+          <w:i/>
+          <w:color w:val="1A2329"/>
+          <w:sz w:val="22"/>
+        </w:rPr>
+        <w:t>trackpad</w:t>
+      </w:r>
+      <w:r>
+        <w:rPr>
+          <w:rFonts w:ascii="Calibri" w:hAnsi="Calibri"/>
+          <w:b w:val="0"/>
+          <w:i w:val="0"/>
+          <w:color w:val="1A2329"/>
+          <w:sz w:val="22"/>
+        </w:rPr>
+        <w:t xml:space="preserve"> o Ctrl+rueda, anclado al punto bajo el cursor) que permite ajustar el nivel de detalle desde una tarea individual hasta la obra completa. Las </w:t>
+      </w:r>
+      <w:r>
+        <w:rPr>
+          <w:rFonts w:ascii="Calibri" w:hAnsi="Calibri"/>
+          <w:b/>
+          <w:i w:val="0"/>
+          <w:color w:val="1A2329"/>
+          <w:sz w:val="22"/>
+        </w:rPr>
+        <w:t>subtareas se agrupan inmediatamente debajo de su tarea padre</w:t>
+      </w:r>
+      <w:r>
+        <w:rPr>
+          <w:rFonts w:ascii="Calibri" w:hAnsi="Calibri"/>
+          <w:b w:val="0"/>
+          <w:i w:val="0"/>
+          <w:color w:val="1A2329"/>
+          <w:sz w:val="22"/>
+        </w:rPr>
+        <w:t xml:space="preserve"> (jerarquía WBS) y las </w:t>
+      </w:r>
+      <w:r>
+        <w:rPr>
+          <w:rFonts w:ascii="Calibri" w:hAnsi="Calibri"/>
+          <w:b/>
+          <w:i w:val="0"/>
+          <w:color w:val="1A2329"/>
+          <w:sz w:val="22"/>
+        </w:rPr>
+        <w:t>dependencias</w:t>
+      </w:r>
+      <w:r>
+        <w:rPr>
+          <w:rFonts w:ascii="Calibri" w:hAnsi="Calibri"/>
+          <w:b w:val="0"/>
+          <w:i w:val="0"/>
+          <w:color w:val="1A2329"/>
+          <w:sz w:val="22"/>
+        </w:rPr>
+        <w:t xml:space="preserve"> se hacen explícitas por partida doble: con flechas sobre la línea de tiempo y con una etiqueta en la columna de tareas (que se omite cuando la predecesora es la propia tarea padre, por redundante). Incluye </w:t>
+      </w:r>
+      <w:r>
+        <w:rPr>
+          <w:rFonts w:ascii="Calibri" w:hAnsi="Calibri"/>
+          <w:b/>
+          <w:i w:val="0"/>
+          <w:color w:val="1A2329"/>
+          <w:sz w:val="22"/>
+        </w:rPr>
         <w:t>cálculo de ruta crítica (CPM)</w:t>
       </w:r>
       <w:r>
@@ -6221,7 +6301,7 @@
           <w:color w:val="1A2329"/>
           <w:sz w:val="22"/>
         </w:rPr>
-        <w:t xml:space="preserve"> para comparar lo planificado con lo replanificado.</w:t>
+        <w:t xml:space="preserve"> para comparar lo planificado con lo replanificado, además de edición y eliminación de tareas desde la propia fila.</w:t>
       </w:r>
     </w:p>
     <w:p>

</xml_diff>

<commit_message>
docs: documentar planilla tipo Sheets (bitácora + IPI)
- Bitácora: entrada 2026-07-01 con el detalle de la reescritura de la planilla
  (zoom, grilla completa, insertar, columnas, rollup de materiales).
- IPI: enriquecido el módulo de planilla con las capacidades tipo hoja de
  cálculo y las columnas opcionales (hito, dependencias, costo).
- Regenerado IPI-CONSTRUCTA.docx.

Co-Authored-By: Claude Opus 4.8 <noreply@anthropic.com>
</commit_message>
<xml_diff>
--- a/docs/IPI-CONSTRUCTA.docx
+++ b/docs/IPI-CONSTRUCTA.docx
@@ -2065,7 +2065,7 @@
                 <w:color w:val="1A2329"/>
                 <w:sz w:val="20"/>
               </w:rPr>
-              <w:t>Módulos de obras, tareas, dependencias M2M, subtareas y calendario laboral implementados; migraciones de base de datos hasta la 0037.</w:t>
+              <w:t>Módulos de obras, tareas, dependencias M2M, subtareas y calendario laboral implementados; migraciones de base de datos hasta la 0038.</w:t>
             </w:r>
           </w:p>
         </w:tc>
@@ -2281,7 +2281,7 @@
                 <w:color w:val="1A2329"/>
                 <w:sz w:val="20"/>
               </w:rPr>
-              <w:t>Carga de PDF/imagen/Excel/texto, extracción estructurada, comparación con recomendación e inconsistencias.</w:t>
+              <w:t>Carga de PDF/imagen/Excel/texto, extracción estructurada, comparación con recomendación e inconsistencias. Módulo de solicitudes de cotización: generación de PDF de solicitud, envío a proveedores por WhatsApp, recepción automática de respuestas PDF desde WhatsApp, análisis comparativo con IA (salida estructurada) y confirmación de proveedor con generación de orden de compra.</w:t>
             </w:r>
           </w:p>
         </w:tc>
@@ -4631,7 +4631,7 @@
           <w:color w:val="1A2329"/>
           <w:sz w:val="22"/>
         </w:rPr>
-        <w:t xml:space="preserve"> base de datos relacional PostgreSQL, con esquema versionado mediante migraciones (Alembic, hasta la versión 0037).</w:t>
+        <w:t xml:space="preserve"> base de datos relacional PostgreSQL, con esquema versionado mediante migraciones (Alembic, hasta la versión 0038).</w:t>
       </w:r>
     </w:p>
     <w:p>
@@ -4949,7 +4949,7 @@
           <w:color w:val="1A2329"/>
           <w:sz w:val="22"/>
         </w:rPr>
-        <w:t xml:space="preserve">El modelo de datos, versionado en treinta y siete migraciones (0001 a 0037), se organiza en torno a la entidad </w:t>
+        <w:t xml:space="preserve">El modelo de datos, versionado en treinta y ocho migraciones (0001 a 0038), se organiza en torno a la entidad </w:t>
       </w:r>
       <w:r>
         <w:rPr>
@@ -5878,7 +5878,7 @@
           <w:color w:val="1A2329"/>
           <w:sz w:val="22"/>
         </w:rPr>
-        <w:t xml:space="preserve"> versionada (treinta y siete en total, 0001 a 0037), de modo que el esquema de la base pudiera evolucionar de manera reproducible. La cronología completa del desarrollo, con sus decisiones y validaciones, se documenta en </w:t>
+        <w:t xml:space="preserve"> versionada (treinta y ocho en total, 0001 a 0038), de modo que el esquema de la base pudiera evolucionar de manera reproducible. La cronología completa del desarrollo, con sus decisiones y validaciones, se documenta en </w:t>
       </w:r>
       <w:r>
         <w:rPr>
@@ -6328,7 +6328,167 @@
           <w:color w:val="1A2329"/>
           <w:sz w:val="22"/>
         </w:rPr>
-        <w:t xml:space="preserve"> vista de edición tipo hoja de cálculo con selección de celdas y rangos, relleno por arrastre con encadenado automático de fechas, copiar/pegar de bloques y deshacer. Se complementa con </w:t>
+        <w:t xml:space="preserve"> vista de edición tipo hoja de cálculo con selección de celdas y rangos, relleno por arrastre con encadenado automático de fechas, copiar/pegar de bloques y deshacer. La planilla replica la experiencia de una hoja de cálculo real: </w:t>
+      </w:r>
+      <w:r>
+        <w:rPr>
+          <w:rFonts w:ascii="Calibri" w:hAnsi="Calibri"/>
+          <w:b/>
+          <w:i w:val="0"/>
+          <w:color w:val="1A2329"/>
+          <w:sz w:val="22"/>
+        </w:rPr>
+        <w:t>zoom continuo</w:t>
+      </w:r>
+      <w:r>
+        <w:rPr>
+          <w:rFonts w:ascii="Calibri" w:hAnsi="Calibri"/>
+          <w:b w:val="0"/>
+          <w:i w:val="0"/>
+          <w:color w:val="1A2329"/>
+          <w:sz w:val="22"/>
+        </w:rPr>
+        <w:t xml:space="preserve"> (gesto de pellizco del </w:t>
+      </w:r>
+      <w:r>
+        <w:rPr>
+          <w:rFonts w:ascii="Calibri" w:hAnsi="Calibri"/>
+          <w:b w:val="0"/>
+          <w:i/>
+          <w:color w:val="1A2329"/>
+          <w:sz w:val="22"/>
+        </w:rPr>
+        <w:t>trackpad</w:t>
+      </w:r>
+      <w:r>
+        <w:rPr>
+          <w:rFonts w:ascii="Calibri" w:hAnsi="Calibri"/>
+          <w:b w:val="0"/>
+          <w:i w:val="0"/>
+          <w:color w:val="1A2329"/>
+          <w:sz w:val="22"/>
+        </w:rPr>
+        <w:t xml:space="preserve">, anclado al cursor) que revela más o menos celdas, una </w:t>
+      </w:r>
+      <w:r>
+        <w:rPr>
+          <w:rFonts w:ascii="Calibri" w:hAnsi="Calibri"/>
+          <w:b/>
+          <w:i w:val="0"/>
+          <w:color w:val="1A2329"/>
+          <w:sz w:val="22"/>
+        </w:rPr>
+        <w:t>grilla que se extiende más allá de los datos</w:t>
+      </w:r>
+      <w:r>
+        <w:rPr>
+          <w:rFonts w:ascii="Calibri" w:hAnsi="Calibri"/>
+          <w:b w:val="0"/>
+          <w:i w:val="0"/>
+          <w:color w:val="1A2329"/>
+          <w:sz w:val="22"/>
+        </w:rPr>
+        <w:t xml:space="preserve"> —con desplazamiento hacia celdas vacías como en una hoja de cálculo—, alta de tareas escribiendo directamente sobre cualquier celda vacía e </w:t>
+      </w:r>
+      <w:r>
+        <w:rPr>
+          <w:rFonts w:ascii="Calibri" w:hAnsi="Calibri"/>
+          <w:b/>
+          <w:i w:val="0"/>
+          <w:color w:val="1A2329"/>
+          <w:sz w:val="22"/>
+        </w:rPr>
+        <w:t>inserción de filas en cualquier posición del orden</w:t>
+      </w:r>
+      <w:r>
+        <w:rPr>
+          <w:rFonts w:ascii="Calibri" w:hAnsi="Calibri"/>
+          <w:b w:val="0"/>
+          <w:i w:val="0"/>
+          <w:color w:val="1A2329"/>
+          <w:sz w:val="22"/>
+        </w:rPr>
+        <w:t xml:space="preserve"> (que se persiste). El usuario puede </w:t>
+      </w:r>
+      <w:r>
+        <w:rPr>
+          <w:rFonts w:ascii="Calibri" w:hAnsi="Calibri"/>
+          <w:b/>
+          <w:i w:val="0"/>
+          <w:color w:val="1A2329"/>
+          <w:sz w:val="22"/>
+        </w:rPr>
+        <w:t>mostrar u ocultar columnas</w:t>
+      </w:r>
+      <w:r>
+        <w:rPr>
+          <w:rFonts w:ascii="Calibri" w:hAnsi="Calibri"/>
+          <w:b w:val="0"/>
+          <w:i w:val="0"/>
+          <w:color w:val="1A2329"/>
+          <w:sz w:val="22"/>
+        </w:rPr>
+        <w:t xml:space="preserve"> según su necesidad; además de las de planificación, dispone de columnas opcionales de </w:t>
+      </w:r>
+      <w:r>
+        <w:rPr>
+          <w:rFonts w:ascii="Calibri" w:hAnsi="Calibri"/>
+          <w:b/>
+          <w:i w:val="0"/>
+          <w:color w:val="1A2329"/>
+          <w:sz w:val="22"/>
+        </w:rPr>
+        <w:t>hito</w:t>
+      </w:r>
+      <w:r>
+        <w:rPr>
+          <w:rFonts w:ascii="Calibri" w:hAnsi="Calibri"/>
+          <w:b w:val="0"/>
+          <w:i w:val="0"/>
+          <w:color w:val="1A2329"/>
+          <w:sz w:val="22"/>
+        </w:rPr>
+        <w:t xml:space="preserve">, </w:t>
+      </w:r>
+      <w:r>
+        <w:rPr>
+          <w:rFonts w:ascii="Calibri" w:hAnsi="Calibri"/>
+          <w:b/>
+          <w:i w:val="0"/>
+          <w:color w:val="1A2329"/>
+          <w:sz w:val="22"/>
+        </w:rPr>
+        <w:t>dependencias</w:t>
+      </w:r>
+      <w:r>
+        <w:rPr>
+          <w:rFonts w:ascii="Calibri" w:hAnsi="Calibri"/>
+          <w:b w:val="0"/>
+          <w:i w:val="0"/>
+          <w:color w:val="1A2329"/>
+          <w:sz w:val="22"/>
+        </w:rPr>
+        <w:t xml:space="preserve"> y </w:t>
+      </w:r>
+      <w:r>
+        <w:rPr>
+          <w:rFonts w:ascii="Calibri" w:hAnsi="Calibri"/>
+          <w:b/>
+          <w:i w:val="0"/>
+          <w:color w:val="1A2329"/>
+          <w:sz w:val="22"/>
+        </w:rPr>
+        <w:t>costo de materiales</w:t>
+      </w:r>
+      <w:r>
+        <w:rPr>
+          <w:rFonts w:ascii="Calibri" w:hAnsi="Calibri"/>
+          <w:b w:val="0"/>
+          <w:i w:val="0"/>
+          <w:color w:val="1A2329"/>
+          <w:sz w:val="22"/>
+        </w:rPr>
+        <w:t xml:space="preserve"> (esta última, un resumen que vincula la planilla con el presupuesto de la tarea). Se complementa con </w:t>
       </w:r>
       <w:r>
         <w:rPr>
@@ -6850,7 +7010,7 @@
           <w:color w:val="1A2329"/>
           <w:sz w:val="22"/>
         </w:rPr>
-        <w:t xml:space="preserve"> cómputo de materiales por tarea, presupuesto por obra (estimado frente a real) y generación de </w:t>
+        <w:t xml:space="preserve"> cómputo de materiales por tarea (con unidad, precio unitario y estado de aprovisionamiento), presupuesto por obra (estimado frente a real) y un flujo de </w:t>
       </w:r>
       <w:r>
         <w:rPr>
@@ -6860,17 +7020,57 @@
           <w:color w:val="1A2329"/>
           <w:sz w:val="22"/>
         </w:rPr>
-        <w:t>órdenes de compra</w:t>
-      </w:r>
-      <w:r>
-        <w:rPr>
-          <w:rFonts w:ascii="Calibri" w:hAnsi="Calibri"/>
-          <w:b w:val="0"/>
-          <w:i w:val="0"/>
-          <w:color w:val="1A2329"/>
-          <w:sz w:val="22"/>
-        </w:rPr>
-        <w:t xml:space="preserve"> a proveedores, con su envío y el seguimiento de la recepción.</w:t>
+        <w:t>solicitudes de cotización</w:t>
+      </w:r>
+      <w:r>
+        <w:rPr>
+          <w:rFonts w:ascii="Calibri" w:hAnsi="Calibri"/>
+          <w:b w:val="0"/>
+          <w:i w:val="0"/>
+          <w:color w:val="1A2329"/>
+          <w:sz w:val="22"/>
+        </w:rPr>
+        <w:t xml:space="preserve">: desde la obra se seleccionan los materiales pendientes y los proveedores a consultar; el sistema genera un PDF de solicitud y lo envía a cada proveedor por WhatsApp. Cuando el proveedor responde con su presupuesto en PDF —también por WhatsApp—, el sistema lo detecta, lo descarga y delega en el módulo de presupuestos la extracción estructurada con IA. Con dos o más respuestas, se dispara automáticamente un </w:t>
+      </w:r>
+      <w:r>
+        <w:rPr>
+          <w:rFonts w:ascii="Calibri" w:hAnsi="Calibri"/>
+          <w:b/>
+          <w:i w:val="0"/>
+          <w:color w:val="1A2329"/>
+          <w:sz w:val="22"/>
+        </w:rPr>
+        <w:t>análisis comparativo</w:t>
+      </w:r>
+      <w:r>
+        <w:rPr>
+          <w:rFonts w:ascii="Calibri" w:hAnsi="Calibri"/>
+          <w:b w:val="0"/>
+          <w:i w:val="0"/>
+          <w:color w:val="1A2329"/>
+          <w:sz w:val="22"/>
+        </w:rPr>
+        <w:t xml:space="preserve"> (Claude con salida estructurada JSON Schema) que compara los presupuestos ítem por ítem, identifica ventajas y riesgos de cada proveedor y emite una recomendación fundamentada. Al confirmar el proveedor elegido, se genera la </w:t>
+      </w:r>
+      <w:r>
+        <w:rPr>
+          <w:rFonts w:ascii="Calibri" w:hAnsi="Calibri"/>
+          <w:b/>
+          <w:i w:val="0"/>
+          <w:color w:val="1A2329"/>
+          <w:sz w:val="22"/>
+        </w:rPr>
+        <w:t>orden de compra</w:t>
+      </w:r>
+      <w:r>
+        <w:rPr>
+          <w:rFonts w:ascii="Calibri" w:hAnsi="Calibri"/>
+          <w:b w:val="0"/>
+          <w:i w:val="0"/>
+          <w:color w:val="1A2329"/>
+          <w:sz w:val="22"/>
+        </w:rPr>
+        <w:t xml:space="preserve"> y los materiales pasan al estado "pedido".</w:t>
       </w:r>
     </w:p>
     <w:p>
@@ -7659,6 +7859,62 @@
           </w:p>
         </w:tc>
       </w:tr>
+      <w:tr>
+        <w:tc>
+          <w:tcPr>
+            <w:tcW w:type="dxa" w:w="3120"/>
+          </w:tcPr>
+          <w:p>
+            <w:r/>
+            <w:r>
+              <w:rPr>
+                <w:rFonts w:ascii="Calibri" w:hAnsi="Calibri"/>
+                <w:b w:val="0"/>
+                <w:i w:val="0"/>
+                <w:color w:val="1A2329"/>
+                <w:sz w:val="20"/>
+              </w:rPr>
+              <w:t>Solicitud de cotización</w:t>
+            </w:r>
+          </w:p>
+        </w:tc>
+        <w:tc>
+          <w:tcPr>
+            <w:tcW w:type="dxa" w:w="3120"/>
+          </w:tcPr>
+          <w:p>
+            <w:r/>
+            <w:r>
+              <w:rPr>
+                <w:rFonts w:ascii="Calibri" w:hAnsi="Calibri"/>
+                <w:b w:val="0"/>
+                <w:i w:val="0"/>
+                <w:color w:val="1A2329"/>
+                <w:sz w:val="20"/>
+              </w:rPr>
+              <w:t>Crear una solicitud, simular respuestas PDF de dos proveedores por WhatsApp y confirmar el proveedor recomendado</w:t>
+            </w:r>
+          </w:p>
+        </w:tc>
+        <w:tc>
+          <w:tcPr>
+            <w:tcW w:type="dxa" w:w="3120"/>
+          </w:tcPr>
+          <w:p>
+            <w:r/>
+            <w:r>
+              <w:rPr>
+                <w:rFonts w:ascii="Calibri" w:hAnsi="Calibri"/>
+                <w:b w:val="0"/>
+                <w:i w:val="0"/>
+                <w:color w:val="1A2329"/>
+                <w:sz w:val="20"/>
+              </w:rPr>
+              <w:t>La IA extrae los datos de cada PDF, genera el análisis comparativo y la orden de compra queda asociada a la solicitud.</w:t>
+            </w:r>
+          </w:p>
+        </w:tc>
+      </w:tr>
     </w:tbl>
     <w:p>
       <w:pPr>
@@ -8828,7 +9084,7 @@
           <w:color w:val="1A2329"/>
           <w:sz w:val="22"/>
         </w:rPr>
-        <w:t>El proyecto CONSTRUCTA permitió construir una plataforma funcional que aborda la desconexión entre la planificación y la ejecución en obra. Se cumplieron los objetivos específicos planteados: la gestión integral de obras y tareas, la visualización del cronograma con ruta crítica y línea base, la carga de baja fricción, el asistente de WhatsApp con identificación de emisores, la bitácora de obra asistida por IA, la gestión de presupuestos con lectura y comparación automática, el repositorio de planos consultable por WhatsApp, el sistema de alertas y el aislamiento multi-inquilino con planes.</w:t>
+        <w:t>El proyecto CONSTRUCTA permitió construir una plataforma funcional que aborda la desconexión entre la planificación y la ejecución en obra. Se cumplieron los objetivos específicos planteados: la gestión integral de obras y tareas, la visualización del cronograma con ruta crítica y línea base, la carga de baja fricción, el asistente de WhatsApp con identificación de emisores, la bitácora de obra asistida por IA, la gestión de presupuestos con lectura y comparación automática, el flujo de solicitudes de cotización a proveedores con análisis comparativo asistido por IA, el repositorio de planos consultable por WhatsApp, el sistema de alertas y el aislamiento multi-inquilino con planes.</w:t>
       </w:r>
     </w:p>
     <w:p>

</xml_diff>

<commit_message>
feat(obra): estado de obra híbrido (automático + manual) + eliminar
Antes el estado arrancaba en planificada y nunca cambiaba. Ahora:
- Automático: recompute_obra_status derivado de las tareas (→ en progreso al
  arrancar, → completada cuando todas están al 100%), enganchado en create/
  update/status/delete de tareas.
- No se pisan: pausada/cancelada/completada son pegajosos; el auto solo maneja
  planificada↔en_progreso→completada.
- Manual: la pastilla de estado (menú por portal) ofrece Pausar/Reactivar;
  terminales solo se Eliminan (deleteObra, cascada). "Marcar completada" y
  "Cancelar" se quitaron (completada es automática; para sacar una obra se
  elimina).
- Reactivar/reabrir recalcula al toque (allow_complete=False) sin re-completar.
- Fix: stopPropagation en el portal (los clics del menú navegaban al resumen).

docs: bitácora + IPI actualizados, .docx regenerado.

Co-Authored-By: Claude Opus 4.8 <noreply@anthropic.com>
</commit_message>
<xml_diff>
--- a/docs/IPI-CONSTRUCTA.docx
+++ b/docs/IPI-CONSTRUCTA.docx
@@ -3381,7 +3381,167 @@
           <w:color w:val="1A2329"/>
           <w:sz w:val="22"/>
         </w:rPr>
-        <w:t xml:space="preserve"> alta mediante asistente de cuatro pasos (datos, responsables, tareas, confirmación), edición, estados (planificada, en progreso, pausada, completada, cancelada) y datos del comitente.</w:t>
+        <w:t xml:space="preserve"> alta mediante asistente de cuatro pasos (datos, responsables, tareas, confirmación), edición y datos del comitente. El </w:t>
+      </w:r>
+      <w:r>
+        <w:rPr>
+          <w:rFonts w:ascii="Calibri" w:hAnsi="Calibri"/>
+          <w:b/>
+          <w:i w:val="0"/>
+          <w:color w:val="1A2329"/>
+          <w:sz w:val="22"/>
+        </w:rPr>
+        <w:t>estado de la obra</w:t>
+      </w:r>
+      <w:r>
+        <w:rPr>
+          <w:rFonts w:ascii="Calibri" w:hAnsi="Calibri"/>
+          <w:b w:val="0"/>
+          <w:i w:val="0"/>
+          <w:color w:val="1A2329"/>
+          <w:sz w:val="22"/>
+        </w:rPr>
+        <w:t xml:space="preserve"> (planificada, en progreso, pausada, completada, cancelada) sigue un modelo </w:t>
+      </w:r>
+      <w:r>
+        <w:rPr>
+          <w:rFonts w:ascii="Calibri" w:hAnsi="Calibri"/>
+          <w:b/>
+          <w:i w:val="0"/>
+          <w:color w:val="1A2329"/>
+          <w:sz w:val="22"/>
+        </w:rPr>
+        <w:t>híbrido</w:t>
+      </w:r>
+      <w:r>
+        <w:rPr>
+          <w:rFonts w:ascii="Calibri" w:hAnsi="Calibri"/>
+          <w:b w:val="0"/>
+          <w:i w:val="0"/>
+          <w:color w:val="1A2329"/>
+          <w:sz w:val="22"/>
+        </w:rPr>
+        <w:t xml:space="preserve">: transiciona de forma </w:t>
+      </w:r>
+      <w:r>
+        <w:rPr>
+          <w:rFonts w:ascii="Calibri" w:hAnsi="Calibri"/>
+          <w:b/>
+          <w:i w:val="0"/>
+          <w:color w:val="1A2329"/>
+          <w:sz w:val="22"/>
+        </w:rPr>
+        <w:t>automática</w:t>
+      </w:r>
+      <w:r>
+        <w:rPr>
+          <w:rFonts w:ascii="Calibri" w:hAnsi="Calibri"/>
+          <w:b w:val="0"/>
+          <w:i w:val="0"/>
+          <w:color w:val="1A2329"/>
+          <w:sz w:val="22"/>
+        </w:rPr>
+        <w:t xml:space="preserve"> según el avance de las tareas (pasa a </w:t>
+      </w:r>
+      <w:r>
+        <w:rPr>
+          <w:rFonts w:ascii="Calibri" w:hAnsi="Calibri"/>
+          <w:b w:val="0"/>
+          <w:i/>
+          <w:color w:val="1A2329"/>
+          <w:sz w:val="22"/>
+        </w:rPr>
+        <w:t>en progreso</w:t>
+      </w:r>
+      <w:r>
+        <w:rPr>
+          <w:rFonts w:ascii="Calibri" w:hAnsi="Calibri"/>
+          <w:b w:val="0"/>
+          <w:i w:val="0"/>
+          <w:color w:val="1A2329"/>
+          <w:sz w:val="22"/>
+        </w:rPr>
+        <w:t xml:space="preserve"> cuando alguna tarea arranca y a </w:t>
+      </w:r>
+      <w:r>
+        <w:rPr>
+          <w:rFonts w:ascii="Calibri" w:hAnsi="Calibri"/>
+          <w:b w:val="0"/>
+          <w:i/>
+          <w:color w:val="1A2329"/>
+          <w:sz w:val="22"/>
+        </w:rPr>
+        <w:t>completada</w:t>
+      </w:r>
+      <w:r>
+        <w:rPr>
+          <w:rFonts w:ascii="Calibri" w:hAnsi="Calibri"/>
+          <w:b w:val="0"/>
+          <w:i w:val="0"/>
+          <w:color w:val="1A2329"/>
+          <w:sz w:val="22"/>
+        </w:rPr>
+        <w:t xml:space="preserve"> cuando todas se terminan), mientras que las decisiones que no pueden inferirse —</w:t>
+      </w:r>
+      <w:r>
+        <w:rPr>
+          <w:rFonts w:ascii="Calibri" w:hAnsi="Calibri"/>
+          <w:b w:val="0"/>
+          <w:i/>
+          <w:color w:val="1A2329"/>
+          <w:sz w:val="22"/>
+        </w:rPr>
+        <w:t>pausar</w:t>
+      </w:r>
+      <w:r>
+        <w:rPr>
+          <w:rFonts w:ascii="Calibri" w:hAnsi="Calibri"/>
+          <w:b w:val="0"/>
+          <w:i w:val="0"/>
+          <w:color w:val="1A2329"/>
+          <w:sz w:val="22"/>
+        </w:rPr>
+        <w:t xml:space="preserve"> y </w:t>
+      </w:r>
+      <w:r>
+        <w:rPr>
+          <w:rFonts w:ascii="Calibri" w:hAnsi="Calibri"/>
+          <w:b w:val="0"/>
+          <w:i/>
+          <w:color w:val="1A2329"/>
+          <w:sz w:val="22"/>
+        </w:rPr>
+        <w:t>reactivar</w:t>
+      </w:r>
+      <w:r>
+        <w:rPr>
+          <w:rFonts w:ascii="Calibri" w:hAnsi="Calibri"/>
+          <w:b w:val="0"/>
+          <w:i w:val="0"/>
+          <w:color w:val="1A2329"/>
+          <w:sz w:val="22"/>
+        </w:rPr>
+        <w:t xml:space="preserve">— se realizan de forma </w:t>
+      </w:r>
+      <w:r>
+        <w:rPr>
+          <w:rFonts w:ascii="Calibri" w:hAnsi="Calibri"/>
+          <w:b/>
+          <w:i w:val="0"/>
+          <w:color w:val="1A2329"/>
+          <w:sz w:val="22"/>
+        </w:rPr>
+        <w:t>manual</w:t>
+      </w:r>
+      <w:r>
+        <w:rPr>
+          <w:rFonts w:ascii="Calibri" w:hAnsi="Calibri"/>
+          <w:b w:val="0"/>
+          <w:i w:val="0"/>
+          <w:color w:val="1A2329"/>
+          <w:sz w:val="22"/>
+        </w:rPr>
+        <w:t>; los estados terminales no se modifican a mano.</w:t>
       </w:r>
     </w:p>
     <w:p>

</xml_diff>

<commit_message>
docs: auditoría sistemática consolidada de todos los módulos
- Nuevo informe maestro docs/auditoria-sistema-consolidada.md que consolida
  los 8 análisis por módulo: cobertura verificada 26/26 rutas del backend,
  hallazgos rankeados por severidad (15 P0 seguridad / ~28 P1 robustez / ~20 P2
  pulido) y la causa raíz transversal (tenant_id no denormalizado → IDOR
  cross-tenant desde 13 endpoints).
- Bitácora (documentacion.md): entrada 2026-07-17 de la auditoría.
- IPI: bullet 'Auditoría técnica sistemática' en la sección Pruebas + .docx
  regenerado con los diagramas embebidos.

Co-Authored-By: Claude Opus 4.8 <noreply@anthropic.com>
</commit_message>
<xml_diff>
--- a/docs/IPI-CONSTRUCTA.docx
+++ b/docs/IPI-CONSTRUCTA.docx
@@ -7430,6 +7430,133 @@
           <w:sz w:val="22"/>
         </w:rPr>
         <w:t>.</w:t>
+      </w:r>
+    </w:p>
+    <w:p>
+      <w:pPr>
+        <w:pStyle w:val="ListBullet"/>
+        <w:spacing w:after="60"/>
+        <w:jc w:val="both"/>
+      </w:pPr>
+      <w:r>
+        <w:rPr>
+          <w:rFonts w:ascii="Calibri" w:hAnsi="Calibri"/>
+          <w:b/>
+          <w:i w:val="0"/>
+          <w:color w:val="1A2329"/>
+          <w:sz w:val="22"/>
+        </w:rPr>
+        <w:t>Auditoría técnica sistemática:</w:t>
+      </w:r>
+      <w:r>
+        <w:rPr>
+          <w:rFonts w:ascii="Calibri" w:hAnsi="Calibri"/>
+          <w:b w:val="0"/>
+          <w:i w:val="0"/>
+          <w:color w:val="1A2329"/>
+          <w:sz w:val="22"/>
+        </w:rPr>
+        <w:t xml:space="preserve"> se auditó el sistema módulo por módulo —las 26 rutas del backend, los servicios y el modelo de datos— con ocho análisis (</w:t>
+      </w:r>
+      <w:r>
+        <w:rPr>
+          <w:rFonts w:ascii="Consolas" w:hAnsi="Consolas"/>
+          <w:b w:val="0"/>
+          <w:i w:val="0"/>
+          <w:color w:val="1A2329"/>
+          <w:sz w:val="21"/>
+        </w:rPr>
+        <w:t>docs/analisis-modulo-*.md</w:t>
+      </w:r>
+      <w:r>
+        <w:rPr>
+          <w:rFonts w:ascii="Calibri" w:hAnsi="Calibri"/>
+          <w:b w:val="0"/>
+          <w:i w:val="0"/>
+          <w:color w:val="1A2329"/>
+          <w:sz w:val="22"/>
+        </w:rPr>
+        <w:t>) consolidados en un informe maestro (</w:t>
+      </w:r>
+      <w:r>
+        <w:rPr>
+          <w:rFonts w:ascii="Consolas" w:hAnsi="Consolas"/>
+          <w:b w:val="0"/>
+          <w:i w:val="0"/>
+          <w:color w:val="1A2329"/>
+          <w:sz w:val="21"/>
+        </w:rPr>
+        <w:t>docs/auditoria-sistema-consolidada.md</w:t>
+      </w:r>
+      <w:r>
+        <w:rPr>
+          <w:rFonts w:ascii="Calibri" w:hAnsi="Calibri"/>
+          <w:b w:val="0"/>
+          <w:i w:val="0"/>
+          <w:color w:val="1A2329"/>
+          <w:sz w:val="22"/>
+        </w:rPr>
+        <w:t>) que clasifica los hallazgos por severidad (seguridad / robustez / pulido) e identifica como tema transversal principal el aislamiento entre empresas (</w:t>
+      </w:r>
+      <w:r>
+        <w:rPr>
+          <w:rFonts w:ascii="Calibri" w:hAnsi="Calibri"/>
+          <w:b w:val="0"/>
+          <w:i/>
+          <w:color w:val="1A2329"/>
+          <w:sz w:val="22"/>
+        </w:rPr>
+        <w:t>tenants</w:t>
+      </w:r>
+      <w:r>
+        <w:rPr>
+          <w:rFonts w:ascii="Calibri" w:hAnsi="Calibri"/>
+          <w:b w:val="0"/>
+          <w:i w:val="0"/>
+          <w:color w:val="1A2329"/>
+          <w:sz w:val="22"/>
+        </w:rPr>
+        <w:t xml:space="preserve">). Como primer arnés de pruebas automatizadas se incorporó un conjunto de tests de aislamiento multi-inquilino con </w:t>
+      </w:r>
+      <w:r>
+        <w:rPr>
+          <w:rFonts w:ascii="Calibri" w:hAnsi="Calibri"/>
+          <w:b w:val="0"/>
+          <w:i/>
+          <w:color w:val="1A2329"/>
+          <w:sz w:val="22"/>
+        </w:rPr>
+        <w:t>pytest</w:t>
+      </w:r>
+      <w:r>
+        <w:rPr>
+          <w:rFonts w:ascii="Calibri" w:hAnsi="Calibri"/>
+          <w:b w:val="0"/>
+          <w:i w:val="0"/>
+          <w:color w:val="1A2329"/>
+          <w:sz w:val="22"/>
+        </w:rPr>
+        <w:t xml:space="preserve"> (</w:t>
+      </w:r>
+      <w:r>
+        <w:rPr>
+          <w:rFonts w:ascii="Consolas" w:hAnsi="Consolas"/>
+          <w:b w:val="0"/>
+          <w:i w:val="0"/>
+          <w:color w:val="1A2329"/>
+          <w:sz w:val="21"/>
+        </w:rPr>
+        <w:t>backend/tests/test_tenant_isolation.py</w:t>
+      </w:r>
+      <w:r>
+        <w:rPr>
+          <w:rFonts w:ascii="Calibri" w:hAnsi="Calibri"/>
+          <w:b w:val="0"/>
+          <w:i w:val="0"/>
+          <w:color w:val="1A2329"/>
+          <w:sz w:val="22"/>
+        </w:rPr>
+        <w:t>), que verifica que un usuario de una empresa no accede a los recursos de otra.</w:t>
       </w:r>
     </w:p>
     <w:p>

</xml_diff>

<commit_message>
fix(historial): cerrar los hallazgos de la auditoría 07
Historial de obra eliminada preservado y recuperable (tenant_id
denormalizado sobrevive al SET NULL de la FK) vía nuevo endpoint admin
+ panel en Configuración. Eventos nuevos para responsables (create/
update/reactivate) y línea base. Límite del tab subido de 30 a 100 con
indicador de truncamiento. Import MS Project XML deja de generar un
evento por fila. Refresh en tiempo real vía Socket.IO centralizado en
HistorialRepository.log(). Traducciones al español, alert_created para
ORDER_RECEIVED, código muerto eliminado, índice compuesto en DB.

Co-Authored-By: Claude Sonnet 5 <noreply@anthropic.com>
</commit_message>
<xml_diff>
--- a/docs/IPI-CONSTRUCTA.docx
+++ b/docs/IPI-CONSTRUCTA.docx
@@ -3141,7 +3141,27 @@
                 <w:color w:val="1A2329"/>
                 <w:sz w:val="20"/>
               </w:rPr>
-              <w:t>Tabla de historial con eventos de tareas, chatbot y alertas, escritos por los servicios.</w:t>
+              <w:t xml:space="preserve">Tabla de historial con eventos de tareas, obras, responsables, línea base, alertas y compras, escritos por los servicios; se actualiza en tiempo real por Socket.IO. El historial de una obra eliminada se preserva (tenant_id denormalizado sobrevive a la FK) y es recuperable desde un panel administrativo. Auditoría dedicada en </w:t>
+            </w:r>
+            <w:r>
+              <w:rPr>
+                <w:rFonts w:ascii="Consolas" w:hAnsi="Consolas"/>
+                <w:b w:val="0"/>
+                <w:i w:val="0"/>
+                <w:color w:val="1A2329"/>
+                <w:sz w:val="19"/>
+              </w:rPr>
+              <w:t>docs/auditoria/07-historial.md</w:t>
+            </w:r>
+            <w:r>
+              <w:rPr>
+                <w:rFonts w:ascii="Calibri" w:hAnsi="Calibri"/>
+                <w:b w:val="0"/>
+                <w:i w:val="0"/>
+                <w:color w:val="1A2329"/>
+                <w:sz w:val="20"/>
+              </w:rPr>
+              <w:t>, cerrada el 27/08/2026.</w:t>
             </w:r>
           </w:p>
         </w:tc>

</xml_diff>

<commit_message>
fix(bitacora): cerrar el resto de la auditoría 08 (P1/P2)
Rate limit por número de WhatsApp antes de gastar en Whisper/Claude.
BitacoraPage se actualiza en tiempo real al llegar una nota nueva y
soporta paginación (Cargar más). El background task avisa al emisor
si falla fuera del try/except interno. reprocess() ya no pisa
sugerencias aplicadas ni queda como no-op silencioso si el audio se
borró del disco. Mensaje específico para audio AMR no soportado.
Filtro "Solo pendientes" y estado de edición de sugerencias
unificados/resincronizados en el frontend.

Cierra docs/auditoria/08-bitacora.md — última auditoría pendiente de
la ronda post-defensa.

Co-Authored-By: Claude Sonnet 5 <noreply@anthropic.com>
</commit_message>
<xml_diff>
--- a/docs/IPI-CONSTRUCTA.docx
+++ b/docs/IPI-CONSTRUCTA.docx
@@ -3506,7 +3506,27 @@
                 <w:color w:val="1A2329"/>
                 <w:sz w:val="20"/>
               </w:rPr>
-              <w:t>) → análisis (Claude Haiku 4.5, salida estructurada) → resumen, puntos clave y sugerencias aplicables. Navegación tarea → notas completa.</w:t>
+              <w:t xml:space="preserve">) → análisis (Claude Haiku 4.5, salida estructurada) → resumen, puntos clave y sugerencias aplicables. Navegación tarea → notas completa. Auditoría dedicada en </w:t>
+            </w:r>
+            <w:r>
+              <w:rPr>
+                <w:rFonts w:ascii="Consolas" w:hAnsi="Consolas"/>
+                <w:b w:val="0"/>
+                <w:i w:val="0"/>
+                <w:color w:val="1A2329"/>
+                <w:sz w:val="19"/>
+              </w:rPr>
+              <w:t>docs/auditoria/08-bitacora.md</w:t>
+            </w:r>
+            <w:r>
+              <w:rPr>
+                <w:rFonts w:ascii="Calibri" w:hAnsi="Calibri"/>
+                <w:b w:val="0"/>
+                <w:i w:val="0"/>
+                <w:color w:val="1A2329"/>
+                <w:sz w:val="20"/>
+              </w:rPr>
+              <w:t xml:space="preserve"> (aislamiento cross-tenant, cuota de IA por WhatsApp, límite de notas por hora, actualización en tiempo real, paginación), cerrada el 27/08/2026.</w:t>
             </w:r>
           </w:p>
         </w:tc>

</xml_diff>